<commit_message>
improved lesson cancelling securtiyy plus misc imporovements
updated lesson cancellation logic. Now a lesson can only be cancelled by a participant (tutor or student). The SqL query has been uopdated as has the controller.

Added protect middleware to the cancel booking rorute handler middleware

Small  changes to the 'Messages' icon to change its colour and hiver state.

Amended the Logo component so that instead of  linking to /home, it sends logged-in users to /home and  sends everyone else to /about.

Did some small standardising of button colours in some components to improve UI consisitency
</commit_message>
<xml_diff>
--- a/docs/meeting minutes/feeedback summary.docx
+++ b/docs/meeting minutes/feeedback summary.docx
@@ -68,9 +68,21 @@
           <w:ilvl w:val="0"/>
           <w:numId w:val="1"/>
         </w:numPr>
-      </w:pPr>
-      <w:r>
+        <w:rPr>
+          <w:color w:val="4EA72E" w:themeColor="accent6"/>
+        </w:rPr>
+      </w:pPr>
+      <w:r>
+        <w:rPr>
+          <w:color w:val="4EA72E" w:themeColor="accent6"/>
+        </w:rPr>
         <w:t>Set booking calendar time slots to intervals of 15 minutes (from current duration of 30 minutes).</w:t>
+      </w:r>
+      <w:r>
+        <w:rPr>
+          <w:color w:val="4EA72E" w:themeColor="accent6"/>
+        </w:rPr>
+        <w:t xml:space="preserve"> </w:t>
       </w:r>
     </w:p>
     <w:p>
@@ -80,14 +92,26 @@
           <w:ilvl w:val="0"/>
           <w:numId w:val="1"/>
         </w:numPr>
-      </w:pPr>
-      <w:r>
+        <w:rPr>
+          <w:color w:val="4EA72E" w:themeColor="accent6"/>
+        </w:rPr>
+      </w:pPr>
+      <w:r>
+        <w:rPr>
+          <w:color w:val="4EA72E" w:themeColor="accent6"/>
+        </w:rPr>
         <w:t xml:space="preserve">Take the student’s own name away from </w:t>
       </w:r>
       <w:r>
+        <w:rPr>
+          <w:color w:val="4EA72E" w:themeColor="accent6"/>
+        </w:rPr>
         <w:t>the ‘</w:t>
       </w:r>
       <w:r>
+        <w:rPr>
+          <w:color w:val="4EA72E" w:themeColor="accent6"/>
+        </w:rPr>
         <w:t>Lesson details’ summary card below the booking calendar.</w:t>
       </w:r>
     </w:p>
@@ -98,8 +122,14 @@
           <w:ilvl w:val="0"/>
           <w:numId w:val="1"/>
         </w:numPr>
-      </w:pPr>
-      <w:r>
+        <w:rPr>
+          <w:color w:val="4EA72E" w:themeColor="accent6"/>
+        </w:rPr>
+      </w:pPr>
+      <w:r>
+        <w:rPr>
+          <w:color w:val="4EA72E" w:themeColor="accent6"/>
+        </w:rPr>
         <w:t>Prevent students from being able to cancel within 24 hours of lesson start time.</w:t>
       </w:r>
     </w:p>
@@ -110,8 +140,14 @@
           <w:ilvl w:val="0"/>
           <w:numId w:val="1"/>
         </w:numPr>
-      </w:pPr>
-      <w:r>
+        <w:rPr>
+          <w:color w:val="EE0000"/>
+        </w:rPr>
+      </w:pPr>
+      <w:r>
+        <w:rPr>
+          <w:color w:val="EE0000"/>
+        </w:rPr>
         <w:t>Prevent a student from being able to cancel another student’s lessons with a particular tutor</w:t>
       </w:r>
     </w:p>
@@ -122,14 +158,26 @@
           <w:ilvl w:val="0"/>
           <w:numId w:val="1"/>
         </w:numPr>
-      </w:pPr>
-      <w:r>
+        <w:rPr>
+          <w:color w:val="EE0000"/>
+        </w:rPr>
+      </w:pPr>
+      <w:r>
+        <w:rPr>
+          <w:color w:val="EE0000"/>
+        </w:rPr>
         <w:t xml:space="preserve">Change </w:t>
       </w:r>
       <w:r>
+        <w:rPr>
+          <w:color w:val="EE0000"/>
+        </w:rPr>
         <w:t>the ‘</w:t>
       </w:r>
       <w:r>
+        <w:rPr>
+          <w:color w:val="EE0000"/>
+        </w:rPr>
         <w:t>teaching levels’ to grades 1-8+</w:t>
       </w:r>
     </w:p>
@@ -140,8 +188,14 @@
           <w:ilvl w:val="0"/>
           <w:numId w:val="1"/>
         </w:numPr>
-      </w:pPr>
-      <w:r>
+        <w:rPr>
+          <w:color w:val="00B050"/>
+        </w:rPr>
+      </w:pPr>
+      <w:r>
+        <w:rPr>
+          <w:color w:val="00B050"/>
+        </w:rPr>
         <w:t>Let tutors see their booked appointments (e.g. a widget on tutor login)</w:t>
       </w:r>
     </w:p>
@@ -152,8 +206,14 @@
           <w:ilvl w:val="0"/>
           <w:numId w:val="1"/>
         </w:numPr>
-      </w:pPr>
-      <w:r>
+        <w:rPr>
+          <w:color w:val="EE0000"/>
+        </w:rPr>
+      </w:pPr>
+      <w:r>
+        <w:rPr>
+          <w:color w:val="EE0000"/>
+        </w:rPr>
         <w:t>Let tutors see a dashboard with info on their students e.g. total lessons with a student and total earnings etc</w:t>
       </w:r>
     </w:p>
@@ -164,8 +224,14 @@
           <w:ilvl w:val="0"/>
           <w:numId w:val="1"/>
         </w:numPr>
-      </w:pPr>
-      <w:r>
+        <w:rPr>
+          <w:color w:val="EE0000"/>
+        </w:rPr>
+      </w:pPr>
+      <w:r>
+        <w:rPr>
+          <w:color w:val="EE0000"/>
+        </w:rPr>
         <w:t>Add a ‘close panel’ button to the ‘lesson details’ panel</w:t>
       </w:r>
     </w:p>
@@ -176,8 +242,14 @@
           <w:ilvl w:val="0"/>
           <w:numId w:val="1"/>
         </w:numPr>
-      </w:pPr>
-      <w:r>
+        <w:rPr>
+          <w:color w:val="EE0000"/>
+        </w:rPr>
+      </w:pPr>
+      <w:r>
+        <w:rPr>
+          <w:color w:val="EE0000"/>
+        </w:rPr>
         <w:t>Add a tutor’s profile picture and instrument to the ‘lesson details’ panel</w:t>
       </w:r>
     </w:p>
@@ -188,16 +260,28 @@
           <w:ilvl w:val="0"/>
           <w:numId w:val="1"/>
         </w:numPr>
-      </w:pPr>
-      <w:r>
+        <w:rPr>
+          <w:color w:val="EE0000"/>
+        </w:rPr>
+      </w:pPr>
+      <w:r>
+        <w:rPr>
+          <w:color w:val="EE0000"/>
+        </w:rPr>
         <w:t>In the ‘</w:t>
       </w:r>
       <w:proofErr w:type="spellStart"/>
       <w:r>
+        <w:rPr>
+          <w:color w:val="EE0000"/>
+        </w:rPr>
         <w:t>TutorProfilePage</w:t>
       </w:r>
       <w:proofErr w:type="spellEnd"/>
       <w:r>
+        <w:rPr>
+          <w:color w:val="EE0000"/>
+        </w:rPr>
         <w:t>’ or sub-components, display errors/issues as messages on-screen rather than via window alerts.</w:t>
       </w:r>
     </w:p>
@@ -208,8 +292,14 @@
           <w:ilvl w:val="0"/>
           <w:numId w:val="1"/>
         </w:numPr>
-      </w:pPr>
-      <w:r>
+        <w:rPr>
+          <w:color w:val="EE0000"/>
+        </w:rPr>
+      </w:pPr>
+      <w:r>
+        <w:rPr>
+          <w:color w:val="EE0000"/>
+        </w:rPr>
         <w:t>For in-person teaching, allow students to see the tutor’s teaching address by clicking.</w:t>
       </w:r>
     </w:p>
@@ -240,8 +330,14 @@
           <w:ilvl w:val="0"/>
           <w:numId w:val="3"/>
         </w:numPr>
-      </w:pPr>
-      <w:r>
+        <w:rPr>
+          <w:color w:val="EE0000"/>
+        </w:rPr>
+      </w:pPr>
+      <w:r>
+        <w:rPr>
+          <w:color w:val="EE0000"/>
+        </w:rPr>
         <w:t>From the student’s perspective, the chat window should display the instrument the tutor will teach (as students may have several teachers)</w:t>
       </w:r>
     </w:p>
@@ -252,9 +348,29 @@
           <w:ilvl w:val="0"/>
           <w:numId w:val="3"/>
         </w:numPr>
-      </w:pPr>
-      <w:r>
-        <w:t>Differentiate the colour of sender/recipient messages in a user’s chat and align them as per WhatsApp  i.e. other party’s messages on left and user’s messages on right.</w:t>
+        <w:rPr>
+          <w:color w:val="00B050"/>
+        </w:rPr>
+      </w:pPr>
+      <w:r>
+        <w:rPr>
+          <w:color w:val="00B050"/>
+        </w:rPr>
+        <w:t xml:space="preserve">Differentiate the colour of sender/recipient messages in a user’s chat and align them as per </w:t>
+      </w:r>
+      <w:proofErr w:type="gramStart"/>
+      <w:r>
+        <w:rPr>
+          <w:color w:val="00B050"/>
+        </w:rPr>
+        <w:t>WhatsApp  i.e.</w:t>
+      </w:r>
+      <w:proofErr w:type="gramEnd"/>
+      <w:r>
+        <w:rPr>
+          <w:color w:val="00B050"/>
+        </w:rPr>
+        <w:t xml:space="preserve"> other party’s messages on left and user’s messages on right.</w:t>
       </w:r>
     </w:p>
     <w:p>
@@ -264,8 +380,14 @@
           <w:ilvl w:val="0"/>
           <w:numId w:val="3"/>
         </w:numPr>
-      </w:pPr>
-      <w:r>
+        <w:rPr>
+          <w:color w:val="00B050"/>
+        </w:rPr>
+      </w:pPr>
+      <w:r>
+        <w:rPr>
+          <w:color w:val="00B050"/>
+        </w:rPr>
         <w:t>Chat window should show historical messages and in real-time.</w:t>
       </w:r>
     </w:p>
@@ -297,11 +419,20 @@
           <w:ilvl w:val="0"/>
           <w:numId w:val="5"/>
         </w:numPr>
-      </w:pPr>
-      <w:r>
+        <w:rPr>
+          <w:color w:val="00B050"/>
+        </w:rPr>
+      </w:pPr>
+      <w:r>
+        <w:rPr>
+          <w:color w:val="00B050"/>
+        </w:rPr>
         <w:t xml:space="preserve">Best to drop the Group tutoring option as implementing it would require mor complicated features e.g. </w:t>
       </w:r>
       <w:r>
+        <w:rPr>
+          <w:color w:val="00B050"/>
+        </w:rPr>
         <w:t>video chat</w:t>
       </w:r>
     </w:p>
@@ -324,10 +455,18 @@
         <w:t xml:space="preserve"> have well-functioning webchat</w:t>
       </w:r>
       <w:r>
-        <w:t xml:space="preserve"> feature </w:t>
-      </w:r>
-      <w:r>
-        <w:t xml:space="preserve"> which I will demonstrate at our next meeting. </w:t>
+        <w:t xml:space="preserve"> </w:t>
+      </w:r>
+      <w:proofErr w:type="gramStart"/>
+      <w:r>
+        <w:t xml:space="preserve">feature </w:t>
+      </w:r>
+      <w:r>
+        <w:t xml:space="preserve"> which</w:t>
+      </w:r>
+      <w:proofErr w:type="gramEnd"/>
+      <w:r>
+        <w:t xml:space="preserve"> I will demonstrate at our next meeting. </w:t>
       </w:r>
       <w:r>
         <w:t>It took longer than planned to implement this feature so, f</w:t>

</xml_diff>

<commit_message>
add close panel button to LEsson details panel in BookingCalendar component
as per project supervisor feedback
</commit_message>
<xml_diff>
--- a/docs/meeting minutes/feeedback summary.docx
+++ b/docs/meeting minutes/feeedback summary.docx
@@ -211,14 +211,14 @@
           <w:numId w:val="1"/>
         </w:numPr>
         <w:rPr>
-          <w:color w:val="EE0000"/>
-        </w:rPr>
-      </w:pPr>
-      <w:r>
-        <w:rPr>
-          <w:color w:val="EE0000"/>
-        </w:rPr>
-        <w:t>Let tutors see a dashboard with info on their students e.g. total lessons with a student and total earnings etc</w:t>
+          <w:color w:val="00B050"/>
+        </w:rPr>
+      </w:pPr>
+      <w:r>
+        <w:rPr>
+          <w:color w:val="00B050"/>
+        </w:rPr>
+        <w:t>Add a ‘close panel’ button to the ‘lesson details’ panel</w:t>
       </w:r>
     </w:p>
     <w:p>
@@ -236,7 +236,7 @@
         <w:rPr>
           <w:color w:val="EE0000"/>
         </w:rPr>
-        <w:t>Add a ‘close panel’ button to the ‘lesson details’ panel</w:t>
+        <w:t>Let tutors see a dashboard with info on their students e.g. total lessons with a student and total earnings etc</w:t>
       </w:r>
     </w:p>
     <w:p>
@@ -337,11 +337,13 @@
           <w:numId w:val="3"/>
         </w:numPr>
         <w:rPr>
+          <w:strike/>
           <w:color w:val="EE0000"/>
         </w:rPr>
       </w:pPr>
       <w:r>
         <w:rPr>
+          <w:strike/>
           <w:color w:val="EE0000"/>
         </w:rPr>
         <w:t>From the student’s perspective, the chat window should display the instrument the tutor will teach (as students may have several teachers)</w:t>

</xml_diff>

<commit_message>
render booking meeaages on screen isnstead of using alert.window
as per supervisor feedback, I altered the booking alert messages so that instead of being shown as alerts on screen, any messages would be rendered on screen.

Achieved via new state in the BookingCalendar component.

Also altered slightly the return value of TutorProfilePage component's handleCancelBooking () function so that. in success case, it returns a message string and not just boolean true.

As the BookingCalendar component uses the handleCancelBooking function from TutorProfilePage prop, I amended the bodyof confirmCancelBooking () function in BookingCalendar component to relfect that change
</commit_message>
<xml_diff>
--- a/docs/meeting minutes/feeedback summary.docx
+++ b/docs/meeting minutes/feeedback summary.docx
@@ -159,30 +159,14 @@
           <w:numId w:val="1"/>
         </w:numPr>
         <w:rPr>
-          <w:strike/>
-          <w:color w:val="EE0000"/>
-        </w:rPr>
-      </w:pPr>
-      <w:r>
-        <w:rPr>
-          <w:strike/>
-          <w:color w:val="EE0000"/>
-        </w:rPr>
-        <w:t xml:space="preserve">Change </w:t>
-      </w:r>
-      <w:r>
-        <w:rPr>
-          <w:strike/>
-          <w:color w:val="EE0000"/>
-        </w:rPr>
-        <w:t>the ‘</w:t>
-      </w:r>
-      <w:r>
-        <w:rPr>
-          <w:strike/>
-          <w:color w:val="EE0000"/>
-        </w:rPr>
-        <w:t>teaching levels’ to grades 1-8+</w:t>
+          <w:color w:val="00B050"/>
+        </w:rPr>
+      </w:pPr>
+      <w:r>
+        <w:rPr>
+          <w:color w:val="00B050"/>
+        </w:rPr>
+        <w:t>Let tutors see their booked appointments (e.g. a widget on tutor login)</w:t>
       </w:r>
     </w:p>
     <w:p>
@@ -200,7 +184,7 @@
         <w:rPr>
           <w:color w:val="00B050"/>
         </w:rPr>
-        <w:t>Let tutors see their booked appointments (e.g. a widget on tutor login)</w:t>
+        <w:t>Add a ‘close panel’ button to the ‘lesson details’ panel</w:t>
       </w:r>
     </w:p>
     <w:p>
@@ -218,7 +202,21 @@
         <w:rPr>
           <w:color w:val="00B050"/>
         </w:rPr>
-        <w:t>Add a ‘close panel’ button to the ‘lesson details’ panel</w:t>
+        <w:t>In the ‘</w:t>
+      </w:r>
+      <w:proofErr w:type="spellStart"/>
+      <w:r>
+        <w:rPr>
+          <w:color w:val="00B050"/>
+        </w:rPr>
+        <w:t>TutorProfilePage</w:t>
+      </w:r>
+      <w:proofErr w:type="spellEnd"/>
+      <w:r>
+        <w:rPr>
+          <w:color w:val="00B050"/>
+        </w:rPr>
+        <w:t>’ or sub-components, display errors/issues as messages on-screen rather than via window alerts.</w:t>
       </w:r>
     </w:p>
     <w:p>
@@ -253,10 +251,9 @@
       </w:pPr>
       <w:r>
         <w:rPr>
-          <w:strike/>
           <w:color w:val="EE0000"/>
         </w:rPr>
-        <w:t>Add a tutor’s profile picture and instrument to the ‘lesson details’ panel</w:t>
+        <w:t>For in-person teaching, allow students to see the tutor’s teaching address by clicking.</w:t>
       </w:r>
     </w:p>
     <w:p>
@@ -267,28 +264,16 @@
           <w:numId w:val="1"/>
         </w:numPr>
         <w:rPr>
+          <w:strike/>
           <w:color w:val="EE0000"/>
         </w:rPr>
       </w:pPr>
       <w:r>
         <w:rPr>
+          <w:strike/>
           <w:color w:val="EE0000"/>
         </w:rPr>
-        <w:t>In the ‘</w:t>
-      </w:r>
-      <w:proofErr w:type="spellStart"/>
-      <w:r>
-        <w:rPr>
-          <w:color w:val="EE0000"/>
-        </w:rPr>
-        <w:t>TutorProfilePage</w:t>
-      </w:r>
-      <w:proofErr w:type="spellEnd"/>
-      <w:r>
-        <w:rPr>
-          <w:color w:val="EE0000"/>
-        </w:rPr>
-        <w:t>’ or sub-components, display errors/issues as messages on-screen rather than via window alerts.</w:t>
+        <w:t>Add a tutor’s profile picture and instrument to the ‘lesson details’ panel</w:t>
       </w:r>
     </w:p>
     <w:p>
@@ -299,15 +284,26 @@
           <w:numId w:val="1"/>
         </w:numPr>
         <w:rPr>
+          <w:strike/>
           <w:color w:val="EE0000"/>
         </w:rPr>
       </w:pPr>
       <w:r>
         <w:rPr>
+          <w:strike/>
           <w:color w:val="EE0000"/>
         </w:rPr>
-        <w:t>For in-person teaching, allow students to see the tutor’s teaching address by clicking.</w:t>
-      </w:r>
+        <w:t>Change the ‘teaching levels’ to grades 1-8+</w:t>
+      </w:r>
+    </w:p>
+    <w:p>
+      <w:pPr>
+        <w:pStyle w:val="NoSpacing"/>
+        <w:ind w:left="720"/>
+        <w:rPr>
+          <w:color w:val="EE0000"/>
+        </w:rPr>
+      </w:pPr>
     </w:p>
     <w:p>
       <w:pPr>

</xml_diff>